<commit_message>
Generar expediente final completo
</commit_message>
<xml_diff>
--- a/backend/templates/INFORME_TECNICO_PLANTILLA.docx
+++ b/backend/templates/INFORME_TECNICO_PLANTILLA.docx
@@ -1,6 +1,6 @@
 
 <file path=word/document.xml><?xml version="1.0" encoding="utf-8"?>
-<w:document xmlns:wpc="http://schemas.microsoft.com/office/word/2010/wordprocessingCanvas" xmlns:cx="http://schemas.microsoft.com/office/drawing/2014/chartex" xmlns:cx1="http://schemas.microsoft.com/office/drawing/2015/9/8/chartex" xmlns:cx2="http://schemas.microsoft.com/office/drawing/2015/10/21/chartex" xmlns:cx3="http://schemas.microsoft.com/office/drawing/2016/5/9/chartex" xmlns:cx4="http://schemas.microsoft.com/office/drawing/2016/5/10/chartex" xmlns:cx5="http://schemas.microsoft.com/office/drawing/2016/5/11/chartex" xmlns:cx6="http://schemas.microsoft.com/office/drawing/2016/5/12/chartex" xmlns:cx7="http://schemas.microsoft.com/office/drawing/2016/5/13/chartex" xmlns:cx8="http://schemas.microsoft.com/office/drawing/2016/5/14/chartex" xmlns:mc="http://schemas.openxmlformats.org/markup-compatibility/2006" xmlns:aink="http://schemas.microsoft.com/office/drawing/2016/ink" xmlns:am3d="http://schemas.microsoft.com/office/drawing/2017/model3d" xmlns:o="urn:schemas-microsoft-com:office:office" xmlns:r="http://schemas.openxmlformats.org/officeDocument/2006/relationships" xmlns:m="http://schemas.openxmlformats.org/officeDocument/2006/math" xmlns:v="urn:schemas-microsoft-com:vml" xmlns:wp14="http://schemas.microsoft.com/office/word/2010/wordprocessingDrawing" xmlns:wp="http://schemas.openxmlformats.org/drawingml/2006/wordprocessingDrawing" xmlns:w10="urn:schemas-microsoft-com:office:word" xmlns:w="http://schemas.openxmlformats.org/wordprocessingml/2006/main" xmlns:w14="http://schemas.microsoft.com/office/word/2010/wordml" xmlns:w15="http://schemas.microsoft.com/office/word/2012/wordml" xmlns:w16cex="http://schemas.microsoft.com/office/word/2018/wordml/cex" xmlns:w16cid="http://schemas.microsoft.com/office/word/2016/wordml/cid" xmlns:w16="http://schemas.microsoft.com/office/word/2018/wordml" xmlns:w16sdtdh="http://schemas.microsoft.com/office/word/2020/wordml/sdtdatahash" xmlns:w16se="http://schemas.microsoft.com/office/word/2015/wordml/symex" xmlns:wpg="http://schemas.microsoft.com/office/word/2010/wordprocessingGroup" xmlns:wpi="http://schemas.microsoft.com/office/word/2010/wordprocessingInk" xmlns:wne="http://schemas.microsoft.com/office/word/2006/wordml" xmlns:wps="http://schemas.microsoft.com/office/word/2010/wordprocessingShape" mc:Ignorable="w14 w15 w16se w16cid w16 w16cex w16sdtdh wp14">
+<w:document xmlns:wpc="http://schemas.microsoft.com/office/word/2010/wordprocessingCanvas" xmlns:cx="http://schemas.microsoft.com/office/drawing/2014/chartex" xmlns:cx1="http://schemas.microsoft.com/office/drawing/2015/9/8/chartex" xmlns:cx2="http://schemas.microsoft.com/office/drawing/2015/10/21/chartex" xmlns:cx3="http://schemas.microsoft.com/office/drawing/2016/5/9/chartex" xmlns:cx4="http://schemas.microsoft.com/office/drawing/2016/5/10/chartex" xmlns:cx5="http://schemas.microsoft.com/office/drawing/2016/5/11/chartex" xmlns:cx6="http://schemas.microsoft.com/office/drawing/2016/5/12/chartex" xmlns:cx7="http://schemas.microsoft.com/office/drawing/2016/5/13/chartex" xmlns:cx8="http://schemas.microsoft.com/office/drawing/2016/5/14/chartex" xmlns:mc="http://schemas.openxmlformats.org/markup-compatibility/2006" xmlns:aink="http://schemas.microsoft.com/office/drawing/2016/ink" xmlns:am3d="http://schemas.microsoft.com/office/drawing/2017/model3d" xmlns:o="urn:schemas-microsoft-com:office:office" xmlns:oel="http://schemas.microsoft.com/office/2019/extlst" xmlns:r="http://schemas.openxmlformats.org/officeDocument/2006/relationships" xmlns:m="http://schemas.openxmlformats.org/officeDocument/2006/math" xmlns:v="urn:schemas-microsoft-com:vml" xmlns:wp14="http://schemas.microsoft.com/office/word/2010/wordprocessingDrawing" xmlns:wp="http://schemas.openxmlformats.org/drawingml/2006/wordprocessingDrawing" xmlns:w10="urn:schemas-microsoft-com:office:word" xmlns:w="http://schemas.openxmlformats.org/wordprocessingml/2006/main" xmlns:w14="http://schemas.microsoft.com/office/word/2010/wordml" xmlns:w15="http://schemas.microsoft.com/office/word/2012/wordml" xmlns:w16cex="http://schemas.microsoft.com/office/word/2018/wordml/cex" xmlns:w16cid="http://schemas.microsoft.com/office/word/2016/wordml/cid" xmlns:w16="http://schemas.microsoft.com/office/word/2018/wordml" xmlns:w16du="http://schemas.microsoft.com/office/word/2023/wordml/word16du" xmlns:w16sdtdh="http://schemas.microsoft.com/office/word/2020/wordml/sdtdatahash" xmlns:w16sdtfl="http://schemas.microsoft.com/office/word/2024/wordml/sdtformatlock" xmlns:w16se="http://schemas.microsoft.com/office/word/2015/wordml/symex" xmlns:wpg="http://schemas.microsoft.com/office/word/2010/wordprocessingGroup" xmlns:wpi="http://schemas.microsoft.com/office/word/2010/wordprocessingInk" xmlns:wne="http://schemas.microsoft.com/office/word/2006/wordml" xmlns:wps="http://schemas.microsoft.com/office/word/2010/wordprocessingShape" mc:Ignorable="w14 w15 w16se w16cid w16 w16cex w16sdtdh w16sdtfl w16du wp14">
   <w:body>
     <w:p>
       <w:pPr>
@@ -276,7 +276,7 @@
                 <v:stroke joinstyle="miter"/>
                 <v:path gradientshapeok="t" o:connecttype="rect"/>
               </v:shapetype>
-              <v:shape id="Cuadro de texto 6" o:spid="_x0000_s1026" type="#_x0000_t202" style="position:absolute;margin-left:100.05pt;margin-top:0;width:260.9pt;height:32.5pt;z-index:-251652096;visibility:visible;mso-wrap-style:square;mso-width-percent:0;mso-height-percent:0;mso-wrap-distance-left:9pt;mso-wrap-distance-top:0;mso-wrap-distance-right:9pt;mso-wrap-distance-bottom:0;mso-position-horizontal:absolute;mso-position-horizontal-relative:margin;mso-position-vertical:absolute;mso-position-vertical-relative:margin;mso-width-percent:0;mso-height-percent:0;mso-width-relative:margin;mso-height-relative:margin;v-text-anchor:top" o:gfxdata="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" filled="f" stroked="f" strokeweight=".5pt">
+              <v:shape id="Cuadro de texto 6" o:spid="_x0000_s1026" type="#_x0000_t202" style="position:absolute;margin-left:100.05pt;margin-top:0;width:260.9pt;height:32.5pt;z-index:-251652096;visibility:visible;mso-wrap-style:square;mso-width-percent:0;mso-height-percent:0;mso-wrap-distance-left:9pt;mso-wrap-distance-top:0;mso-wrap-distance-right:9pt;mso-wrap-distance-bottom:0;mso-position-horizontal:absolute;mso-position-horizontal-relative:margin;mso-position-vertical:absolute;mso-position-vertical-relative:margin;mso-width-percent:0;mso-height-percent:0;mso-width-relative:margin;mso-height-relative:margin;v-text-anchor:top" o:gfxdata="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" filled="f" stroked="f" strokeweight=".5pt">
                 <v:shadow on="t" color="black" opacity="26214f" origin="-.5,-.5" offset=".74836mm,.74836mm"/>
                 <v:textbox>
                   <w:txbxContent>
@@ -889,7 +889,33 @@
                                 <w:szCs w:val="20"/>
                                 <w:lang w:val="es-PE"/>
                               </w:rPr>
-                              <w:t xml:space="preserve">Jr. Los Cocos Mz. </w:t>
+                              <w:t xml:space="preserve">Jr. Los Cocos </w:t>
+                            </w:r>
+                            <w:proofErr w:type="spellStart"/>
+                            <w:r>
+                              <w:rPr>
+                                <w:rFonts w:ascii="Arial MT" w:hAnsi="Arial MT"/>
+                                <w:b/>
+                                <w:bCs/>
+                                <w:color w:val="005E5E"/>
+                                <w:sz w:val="20"/>
+                                <w:szCs w:val="20"/>
+                                <w:lang w:val="es-PE"/>
+                              </w:rPr>
+                              <w:t>Mz</w:t>
+                            </w:r>
+                            <w:proofErr w:type="spellEnd"/>
+                            <w:r>
+                              <w:rPr>
+                                <w:rFonts w:ascii="Arial MT" w:hAnsi="Arial MT"/>
+                                <w:b/>
+                                <w:bCs/>
+                                <w:color w:val="005E5E"/>
+                                <w:sz w:val="20"/>
+                                <w:szCs w:val="20"/>
+                                <w:lang w:val="es-PE"/>
+                              </w:rPr>
+                              <w:t xml:space="preserve">. </w:t>
                             </w:r>
                             <w:r>
                               <w:rPr>
@@ -901,7 +927,19 @@
                                 <w:szCs w:val="20"/>
                                 <w:lang w:val="pt-PT"/>
                               </w:rPr>
-                              <w:t xml:space="preserve">H Lte. 7 Urb. </w:t>
+                              <w:t xml:space="preserve">H Lte. </w:t>
+                            </w:r>
+                            <w:r>
+                              <w:rPr>
+                                <w:rFonts w:ascii="Arial MT" w:hAnsi="Arial MT"/>
+                                <w:b/>
+                                <w:bCs/>
+                                <w:color w:val="005E5E"/>
+                                <w:sz w:val="20"/>
+                                <w:szCs w:val="20"/>
+                                <w:lang w:val="pt-PT"/>
+                              </w:rPr>
+                              <w:t xml:space="preserve">7 Urb. </w:t>
                             </w:r>
                             <w:r>
                               <w:rPr>
@@ -938,7 +976,7 @@
           </mc:Choice>
           <mc:Fallback>
             <w:pict>
-              <v:shape w14:anchorId="0EEA7F2B" id="Cuadro de texto 7" o:spid="_x0000_s1027" type="#_x0000_t202" style="position:absolute;margin-left:66.75pt;margin-top:47.95pt;width:344.65pt;height:33.85pt;z-index:-251651072;visibility:visible;mso-wrap-style:square;mso-width-percent:0;mso-height-percent:0;mso-wrap-distance-left:9pt;mso-wrap-distance-top:0;mso-wrap-distance-right:9pt;mso-wrap-distance-bottom:0;mso-position-horizontal:absolute;mso-position-horizontal-relative:margin;mso-position-vertical:absolute;mso-position-vertical-relative:margin;mso-width-percent:0;mso-height-percent:0;mso-width-relative:margin;mso-height-relative:margin;v-text-anchor:top" o:gfxdata="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" filled="f" stroked="f" strokeweight=".5pt">
+              <v:shape w14:anchorId="0EEA7F2B" id="Cuadro de texto 7" o:spid="_x0000_s1027" type="#_x0000_t202" style="position:absolute;margin-left:66.75pt;margin-top:47.95pt;width:344.65pt;height:33.85pt;z-index:-251651072;visibility:visible;mso-wrap-style:square;mso-width-percent:0;mso-height-percent:0;mso-wrap-distance-left:9pt;mso-wrap-distance-top:0;mso-wrap-distance-right:9pt;mso-wrap-distance-bottom:0;mso-position-horizontal:absolute;mso-position-horizontal-relative:margin;mso-position-vertical:absolute;mso-position-vertical-relative:margin;mso-width-percent:0;mso-height-percent:0;mso-width-relative:margin;mso-height-relative:margin;v-text-anchor:top" o:gfxdata="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" filled="f" stroked="f" strokeweight=".5pt">
                 <v:textbox>
                   <w:txbxContent>
                     <w:p>
@@ -1163,7 +1201,33 @@
                           <w:szCs w:val="20"/>
                           <w:lang w:val="es-PE"/>
                         </w:rPr>
-                        <w:t xml:space="preserve">Jr. Los Cocos Mz. </w:t>
+                        <w:t xml:space="preserve">Jr. Los Cocos </w:t>
+                      </w:r>
+                      <w:proofErr w:type="spellStart"/>
+                      <w:r>
+                        <w:rPr>
+                          <w:rFonts w:ascii="Arial MT" w:hAnsi="Arial MT"/>
+                          <w:b/>
+                          <w:bCs/>
+                          <w:color w:val="005E5E"/>
+                          <w:sz w:val="20"/>
+                          <w:szCs w:val="20"/>
+                          <w:lang w:val="es-PE"/>
+                        </w:rPr>
+                        <w:t>Mz</w:t>
+                      </w:r>
+                      <w:proofErr w:type="spellEnd"/>
+                      <w:r>
+                        <w:rPr>
+                          <w:rFonts w:ascii="Arial MT" w:hAnsi="Arial MT"/>
+                          <w:b/>
+                          <w:bCs/>
+                          <w:color w:val="005E5E"/>
+                          <w:sz w:val="20"/>
+                          <w:szCs w:val="20"/>
+                          <w:lang w:val="es-PE"/>
+                        </w:rPr>
+                        <w:t xml:space="preserve">. </w:t>
                       </w:r>
                       <w:r>
                         <w:rPr>
@@ -1175,7 +1239,19 @@
                           <w:szCs w:val="20"/>
                           <w:lang w:val="pt-PT"/>
                         </w:rPr>
-                        <w:t xml:space="preserve">H Lte. 7 Urb. </w:t>
+                        <w:t xml:space="preserve">H Lte. </w:t>
+                      </w:r>
+                      <w:r>
+                        <w:rPr>
+                          <w:rFonts w:ascii="Arial MT" w:hAnsi="Arial MT"/>
+                          <w:b/>
+                          <w:bCs/>
+                          <w:color w:val="005E5E"/>
+                          <w:sz w:val="20"/>
+                          <w:szCs w:val="20"/>
+                          <w:lang w:val="pt-PT"/>
+                        </w:rPr>
+                        <w:t xml:space="preserve">7 Urb. </w:t>
                       </w:r>
                       <w:r>
                         <w:rPr>
@@ -1235,7 +1311,7 @@
           <w:noProof/>
         </w:rPr>
         <w:drawing>
-          <wp:anchor distT="0" distB="0" distL="114300" distR="114300" simplePos="0" relativeHeight="251666432" behindDoc="1" locked="0" layoutInCell="1" allowOverlap="1" wp14:anchorId="6101A621" wp14:editId="174F2DC3">
+          <wp:anchor distT="0" distB="0" distL="114300" distR="114300" simplePos="0" relativeHeight="251666432" behindDoc="1" locked="0" layoutInCell="1" allowOverlap="1" wp14:anchorId="6101A621" wp14:editId="4A3F329E">
             <wp:simplePos x="0" y="0"/>
             <wp:positionH relativeFrom="margin">
               <wp:posOffset>4112564</wp:posOffset>
@@ -1392,7 +1468,21 @@
         <w:rPr>
           <w:b/>
         </w:rPr>
-        <w:t>Certificado con resolución directorial 2857-2022-DSAIA-DIRIS-LE/DIRIS</w:t>
+        <w:t xml:space="preserve">Certificado con resolución </w:t>
+      </w:r>
+      <w:proofErr w:type="spellStart"/>
+      <w:r>
+        <w:rPr>
+          <w:b/>
+        </w:rPr>
+        <w:t>directorial</w:t>
+      </w:r>
+      <w:proofErr w:type="spellEnd"/>
+      <w:r>
+        <w:rPr>
+          <w:b/>
+        </w:rPr>
+        <w:t xml:space="preserve"> 2857-2022-DSAIA-DIRIS-LE/DIRIS</w:t>
       </w:r>
       <w:r>
         <w:rPr>
@@ -1769,11 +1859,19 @@
                               </w:rPr>
                               <w:t xml:space="preserve"> </w:t>
                             </w:r>
+                            <w:proofErr w:type="spellStart"/>
                             <w:r>
                               <w:rPr>
                                 <w:color w:val="0070C0"/>
                               </w:rPr>
-                              <w:t xml:space="preserve">N° </w:t>
+                              <w:t>N°</w:t>
+                            </w:r>
+                            <w:proofErr w:type="spellEnd"/>
+                            <w:r>
+                              <w:rPr>
+                                <w:color w:val="0070C0"/>
+                              </w:rPr>
+                              <w:t xml:space="preserve"> </w:t>
                             </w:r>
                             <w:r>
                               <w:rPr>
@@ -1954,7 +2052,7 @@
           </mc:Choice>
           <mc:Fallback>
             <w:pict>
-              <v:shape w14:anchorId="24E81363" id="Cuadro de texto 2" o:spid="_x0000_s1028" type="#_x0000_t202" style="position:absolute;left:0;text-align:left;margin-left:-2.65pt;margin-top:10.95pt;width:448.3pt;height:87.9pt;z-index:251660288;visibility:visible;mso-wrap-style:square;mso-width-percent:0;mso-height-percent:0;mso-wrap-distance-left:9pt;mso-wrap-distance-top:0;mso-wrap-distance-right:9pt;mso-wrap-distance-bottom:0;mso-position-horizontal:absolute;mso-position-horizontal-relative:text;mso-position-vertical:absolute;mso-position-vertical-relative:text;mso-width-percent:0;mso-height-percent:0;mso-width-relative:margin;mso-height-relative:margin;v-text-anchor:top" o:gfxdata="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" filled="f" stroked="f" strokeweight=".5pt">
+              <v:shape w14:anchorId="24E81363" id="Cuadro de texto 2" o:spid="_x0000_s1028" type="#_x0000_t202" style="position:absolute;left:0;text-align:left;margin-left:-2.65pt;margin-top:10.95pt;width:448.3pt;height:87.9pt;z-index:251660288;visibility:visible;mso-wrap-style:square;mso-width-percent:0;mso-height-percent:0;mso-wrap-distance-left:9pt;mso-wrap-distance-top:0;mso-wrap-distance-right:9pt;mso-wrap-distance-bottom:0;mso-position-horizontal:absolute;mso-position-horizontal-relative:text;mso-position-vertical:absolute;mso-position-vertical-relative:text;mso-width-percent:0;mso-height-percent:0;mso-width-relative:margin;mso-height-relative:margin;v-text-anchor:top" o:gfxdata="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" filled="f" stroked="f" strokeweight=".5pt">
                 <v:textbox>
                   <w:txbxContent>
                     <w:p>
@@ -2028,11 +2126,19 @@
                         </w:rPr>
                         <w:t xml:space="preserve"> </w:t>
                       </w:r>
+                      <w:proofErr w:type="spellStart"/>
                       <w:r>
                         <w:rPr>
                           <w:color w:val="0070C0"/>
                         </w:rPr>
-                        <w:t xml:space="preserve">N° </w:t>
+                        <w:t>N°</w:t>
+                      </w:r>
+                      <w:proofErr w:type="spellEnd"/>
+                      <w:r>
+                        <w:rPr>
+                          <w:color w:val="0070C0"/>
+                        </w:rPr>
+                        <w:t xml:space="preserve"> </w:t>
                       </w:r>
                       <w:r>
                         <w:rPr>
@@ -2232,6 +2338,7 @@
         </w:rPr>
         <w:t xml:space="preserve"> </w:t>
       </w:r>
+      <w:proofErr w:type="spellStart"/>
       <w:r>
         <w:rPr>
           <w:sz w:val="23"/>
@@ -2240,6 +2347,7 @@
         </w:rPr>
         <w:t>N°</w:t>
       </w:r>
+      <w:proofErr w:type="spellEnd"/>
       <w:r>
         <w:rPr>
           <w:spacing w:val="-5"/>
@@ -3122,6 +3230,7 @@
         </w:rPr>
         <w:t xml:space="preserve"> </w:t>
       </w:r>
+      <w:proofErr w:type="gramStart"/>
       <w:r>
         <w:rPr>
           <w:sz w:val="24"/>
@@ -3141,6 +3250,7 @@
         </w:rPr>
         <w:t>las</w:t>
       </w:r>
+      <w:proofErr w:type="gramEnd"/>
       <w:r>
         <w:rPr>
           <w:spacing w:val="-1"/>
@@ -3623,11 +3733,19 @@
         </w:rPr>
         <w:t xml:space="preserve"> </w:t>
       </w:r>
-      <w:r>
-        <w:rPr>
-          <w:sz w:val="24"/>
-        </w:rPr>
-        <w:t>Sedapal.</w:t>
+      <w:proofErr w:type="spellStart"/>
+      <w:r>
+        <w:rPr>
+          <w:sz w:val="24"/>
+        </w:rPr>
+        <w:t>Sedapal</w:t>
+      </w:r>
+      <w:proofErr w:type="spellEnd"/>
+      <w:r>
+        <w:rPr>
+          <w:sz w:val="24"/>
+        </w:rPr>
+        <w:t>.</w:t>
       </w:r>
       <w:r>
         <w:rPr>
@@ -3802,8 +3920,17 @@
           <w:b/>
           <w:sz w:val="24"/>
         </w:rPr>
-        <w:t>(biobacterias</w:t>
-      </w:r>
+        <w:t>(</w:t>
+      </w:r>
+      <w:proofErr w:type="spellStart"/>
+      <w:r>
+        <w:rPr>
+          <w:b/>
+          <w:sz w:val="24"/>
+        </w:rPr>
+        <w:t>biobacterias</w:t>
+      </w:r>
+      <w:proofErr w:type="spellEnd"/>
       <w:r>
         <w:rPr>
           <w:b/>
@@ -3870,7 +3997,14 @@
         <w:rPr>
           <w:sz w:val="24"/>
         </w:rPr>
-        <w:t xml:space="preserve">función de la </w:t>
+        <w:t xml:space="preserve">función de </w:t>
+      </w:r>
+      <w:proofErr w:type="gramStart"/>
+      <w:r>
+        <w:rPr>
+          <w:sz w:val="24"/>
+        </w:rPr>
+        <w:t xml:space="preserve">la </w:t>
       </w:r>
       <w:r>
         <w:rPr>
@@ -3883,7 +4017,14 @@
         <w:rPr>
           <w:sz w:val="24"/>
         </w:rPr>
-        <w:t>evacuación al alcantarillado y el promedio del consumo del establecimiento en</w:t>
+        <w:t>evacuación</w:t>
+      </w:r>
+      <w:proofErr w:type="gramEnd"/>
+      <w:r>
+        <w:rPr>
+          <w:sz w:val="24"/>
+        </w:rPr>
+        <w:t xml:space="preserve"> al alcantarillado y el promedio del consumo del establecimiento en</w:t>
       </w:r>
       <w:r>
         <w:rPr>
@@ -3959,7 +4100,21 @@
         <w:rPr>
           <w:sz w:val="24"/>
         </w:rPr>
-        <w:t>Se ha aplicado la dosificación requerida de biobacterias orgánicas en la trampa de grasa, las cajas de registro y las tuberías sanitarias</w:t>
+        <w:t xml:space="preserve">Se ha aplicado la dosificación requerida de </w:t>
+      </w:r>
+      <w:proofErr w:type="spellStart"/>
+      <w:r>
+        <w:rPr>
+          <w:sz w:val="24"/>
+        </w:rPr>
+        <w:t>biobacterias</w:t>
+      </w:r>
+      <w:proofErr w:type="spellEnd"/>
+      <w:r>
+        <w:rPr>
+          <w:sz w:val="24"/>
+        </w:rPr>
+        <w:t xml:space="preserve"> orgánicas en la trampa de grasa, las cajas de registro y las tuberías sanitarias</w:t>
       </w:r>
       <w:r>
         <w:rPr>
@@ -4171,8 +4326,17 @@
           <w:b/>
           <w:sz w:val="24"/>
         </w:rPr>
-        <w:t>(biobacterias</w:t>
-      </w:r>
+        <w:t>(</w:t>
+      </w:r>
+      <w:proofErr w:type="spellStart"/>
+      <w:r>
+        <w:rPr>
+          <w:b/>
+          <w:sz w:val="24"/>
+        </w:rPr>
+        <w:t>biobacterias</w:t>
+      </w:r>
+      <w:proofErr w:type="spellEnd"/>
       <w:r>
         <w:rPr>
           <w:b/>
@@ -4431,7 +4595,42 @@
         <w:rPr>
           <w:sz w:val="24"/>
         </w:rPr>
-        <w:t xml:space="preserve">procedimiento de los efluentes, no sin antes dar aviso a Sedapal con 5 días de </w:t>
+        <w:t xml:space="preserve">procedimiento de los efluentes, no sin antes </w:t>
+      </w:r>
+      <w:proofErr w:type="gramStart"/>
+      <w:r>
+        <w:rPr>
+          <w:sz w:val="24"/>
+        </w:rPr>
+        <w:t>dar aviso</w:t>
+      </w:r>
+      <w:proofErr w:type="gramEnd"/>
+      <w:r>
+        <w:rPr>
+          <w:sz w:val="24"/>
+        </w:rPr>
+        <w:t xml:space="preserve"> a </w:t>
+      </w:r>
+      <w:proofErr w:type="spellStart"/>
+      <w:r>
+        <w:rPr>
+          <w:sz w:val="24"/>
+        </w:rPr>
+        <w:t>Sedapal</w:t>
+      </w:r>
+      <w:proofErr w:type="spellEnd"/>
+      <w:r>
+        <w:rPr>
+          <w:sz w:val="24"/>
+        </w:rPr>
+        <w:t xml:space="preserve"> con 5 días </w:t>
+      </w:r>
+      <w:proofErr w:type="gramStart"/>
+      <w:r>
+        <w:rPr>
+          <w:sz w:val="24"/>
+        </w:rPr>
+        <w:t xml:space="preserve">de </w:t>
       </w:r>
       <w:r>
         <w:rPr>
@@ -4444,7 +4643,14 @@
         <w:rPr>
           <w:sz w:val="24"/>
         </w:rPr>
-        <w:t>anticipación,</w:t>
+        <w:t>anticipación</w:t>
+      </w:r>
+      <w:proofErr w:type="gramEnd"/>
+      <w:r>
+        <w:rPr>
+          <w:sz w:val="24"/>
+        </w:rPr>
+        <w:t>,</w:t>
       </w:r>
       <w:r>
         <w:rPr>
@@ -4553,7 +4759,7 @@
     </w:p>
     <w:p>
       <w:pPr>
-        <w:spacing w:line="360" w:lineRule="auto"/>
+        <w:spacing w:after="120"/>
         <w:rPr>
           <w:b/>
           <w:bCs/>
@@ -4732,8 +4938,20 @@
                 <w:sz w:val="20"/>
                 <w:szCs w:val="20"/>
               </w:rPr>
-              <w:t>Anexo N°</w:t>
+              <w:t xml:space="preserve">Anexo </w:t>
             </w:r>
+            <w:proofErr w:type="spellStart"/>
+            <w:r>
+              <w:rPr>
+                <w:b/>
+                <w:bCs/>
+                <w:color w:val="FFFFFF" w:themeColor="background1"/>
+                <w:sz w:val="20"/>
+                <w:szCs w:val="20"/>
+              </w:rPr>
+              <w:t>N°</w:t>
+            </w:r>
+            <w:proofErr w:type="spellEnd"/>
           </w:p>
         </w:tc>
       </w:tr>
@@ -5174,7 +5392,27 @@
                 <w:sz w:val="20"/>
                 <w:szCs w:val="20"/>
               </w:rPr>
-              <w:t>Aceites y Grasas (AyG)</w:t>
+              <w:t>Aceites y Grasas (</w:t>
+            </w:r>
+            <w:proofErr w:type="spellStart"/>
+            <w:r>
+              <w:rPr>
+                <w:b/>
+                <w:bCs/>
+                <w:sz w:val="20"/>
+                <w:szCs w:val="20"/>
+              </w:rPr>
+              <w:t>AyG</w:t>
+            </w:r>
+            <w:proofErr w:type="spellEnd"/>
+            <w:r>
+              <w:rPr>
+                <w:b/>
+                <w:bCs/>
+                <w:sz w:val="20"/>
+                <w:szCs w:val="20"/>
+              </w:rPr>
+              <w:t>)</w:t>
             </w:r>
           </w:p>
         </w:tc>
@@ -5281,7 +5519,7 @@
     <w:p>
       <w:pPr>
         <w:pStyle w:val="Textoindependiente"/>
-        <w:spacing w:before="7"/>
+        <w:spacing w:before="120" w:after="120"/>
         <w:rPr>
           <w:sz w:val="20"/>
         </w:rPr>
@@ -5365,17 +5603,6 @@
           </wp:anchor>
         </w:drawing>
       </w:r>
-    </w:p>
-    <w:p>
-      <w:pPr>
-        <w:spacing w:line="360" w:lineRule="auto"/>
-        <w:rPr>
-          <w:b/>
-          <w:bCs/>
-          <w:sz w:val="28"/>
-          <w:szCs w:val="28"/>
-        </w:rPr>
-      </w:pPr>
       <w:r>
         <w:rPr>
           <w:b/>
@@ -5545,8 +5772,20 @@
                 <w:sz w:val="20"/>
                 <w:szCs w:val="20"/>
               </w:rPr>
-              <w:t>Anexo N°</w:t>
+              <w:t xml:space="preserve">Anexo </w:t>
             </w:r>
+            <w:proofErr w:type="spellStart"/>
+            <w:r>
+              <w:rPr>
+                <w:b/>
+                <w:bCs/>
+                <w:color w:val="FFFFFF" w:themeColor="background1"/>
+                <w:sz w:val="20"/>
+                <w:szCs w:val="20"/>
+              </w:rPr>
+              <w:t>N°</w:t>
+            </w:r>
+            <w:proofErr w:type="spellEnd"/>
           </w:p>
         </w:tc>
       </w:tr>
@@ -5987,7 +6226,27 @@
                 <w:sz w:val="20"/>
                 <w:szCs w:val="20"/>
               </w:rPr>
-              <w:t>Aceites y Grasas (AyG)</w:t>
+              <w:t>Aceites y Grasas (</w:t>
+            </w:r>
+            <w:proofErr w:type="spellStart"/>
+            <w:r>
+              <w:rPr>
+                <w:b/>
+                <w:bCs/>
+                <w:sz w:val="20"/>
+                <w:szCs w:val="20"/>
+              </w:rPr>
+              <w:t>AyG</w:t>
+            </w:r>
+            <w:proofErr w:type="spellEnd"/>
+            <w:r>
+              <w:rPr>
+                <w:b/>
+                <w:bCs/>
+                <w:sz w:val="20"/>
+                <w:szCs w:val="20"/>
+              </w:rPr>
+              <w:t>)</w:t>
             </w:r>
           </w:p>
         </w:tc>
@@ -6090,22 +6349,11 @@
           </w:p>
         </w:tc>
       </w:tr>
-      <w:bookmarkEnd w:id="1"/>
     </w:tbl>
+    <w:bookmarkEnd w:id="1"/>
     <w:p>
       <w:pPr>
-        <w:pStyle w:val="Ttulo1"/>
-        <w:ind w:left="284"/>
-        <w:jc w:val="both"/>
-        <w:rPr>
-          <w:sz w:val="20"/>
-          <w:szCs w:val="20"/>
-        </w:rPr>
-      </w:pPr>
-    </w:p>
-    <w:p>
-      <w:pPr>
-        <w:spacing w:line="360" w:lineRule="auto"/>
+        <w:spacing w:before="120" w:after="120"/>
         <w:rPr>
           <w:b/>
           <w:bCs/>
@@ -6121,12 +6369,6 @@
           <w:szCs w:val="28"/>
         </w:rPr>
         <w:t>Resultados antes del tratamiento – Anexo 2</w:t>
-      </w:r>
-      <w:r>
-        <w:rPr>
-          <w:noProof/>
-        </w:rPr>
-        <w:t xml:space="preserve"> </w:t>
       </w:r>
     </w:p>
     <w:tbl>
@@ -6574,16 +6816,7 @@
     </w:tbl>
     <w:p>
       <w:pPr>
-        <w:pStyle w:val="Textoindependiente"/>
-        <w:spacing w:before="7"/>
-        <w:rPr>
-          <w:sz w:val="20"/>
-        </w:rPr>
-      </w:pPr>
-    </w:p>
-    <w:p>
-      <w:pPr>
-        <w:spacing w:line="360" w:lineRule="auto"/>
+        <w:spacing w:before="120" w:after="120"/>
         <w:rPr>
           <w:b/>
           <w:bCs/>
@@ -7155,6 +7388,7 @@
         </w:rPr>
         <w:t xml:space="preserve"> </w:t>
       </w:r>
+      <w:proofErr w:type="spellStart"/>
       <w:r>
         <w:rPr>
           <w:b/>
@@ -7163,7 +7397,18 @@
           <w:sz w:val="24"/>
           <w:szCs w:val="24"/>
         </w:rPr>
-        <w:t>N° **NIENSAYO**</w:t>
+        <w:t>N°</w:t>
+      </w:r>
+      <w:proofErr w:type="spellEnd"/>
+      <w:r>
+        <w:rPr>
+          <w:b/>
+          <w:bCs/>
+          <w:color w:val="0070C0"/>
+          <w:sz w:val="24"/>
+          <w:szCs w:val="24"/>
+        </w:rPr>
+        <w:t xml:space="preserve"> **NIENSAYO**</w:t>
       </w:r>
       <w:r>
         <w:rPr>
@@ -7407,7 +7652,27 @@
           <w:spacing w:val="-1"/>
           <w:sz w:val="24"/>
         </w:rPr>
-        <w:t>(biobacterias orgánicas)</w:t>
+        <w:t>(</w:t>
+      </w:r>
+      <w:proofErr w:type="spellStart"/>
+      <w:r>
+        <w:rPr>
+          <w:b/>
+          <w:bCs/>
+          <w:spacing w:val="-1"/>
+          <w:sz w:val="24"/>
+        </w:rPr>
+        <w:t>biobacterias</w:t>
+      </w:r>
+      <w:proofErr w:type="spellEnd"/>
+      <w:r>
+        <w:rPr>
+          <w:b/>
+          <w:bCs/>
+          <w:spacing w:val="-1"/>
+          <w:sz w:val="24"/>
+        </w:rPr>
+        <w:t xml:space="preserve"> orgánicas)</w:t>
       </w:r>
       <w:r>
         <w:rPr>
@@ -7427,7 +7692,6 @@
           <w:sz w:val="28"/>
           <w:szCs w:val="28"/>
         </w:rPr>
-        <w:lastRenderedPageBreak/>
         <w:t>5</w:t>
       </w:r>
       <w:r>
@@ -7464,6 +7728,7 @@
         <w:rPr>
           <w:sz w:val="24"/>
         </w:rPr>
+        <w:lastRenderedPageBreak/>
         <w:t>Se</w:t>
       </w:r>
       <w:r>
@@ -8028,7 +8293,7 @@
           </mc:Choice>
           <mc:Fallback>
             <w:pict>
-              <v:shape w14:anchorId="129A1F1C" id="Cuadro de texto 16" o:spid="_x0000_s1029" type="#_x0000_t202" style="position:absolute;margin-left:29.45pt;margin-top:9.45pt;width:174.65pt;height:64.5pt;z-index:251661312;visibility:visible;mso-wrap-style:square;mso-width-percent:0;mso-height-percent:0;mso-wrap-distance-left:9pt;mso-wrap-distance-top:0;mso-wrap-distance-right:9pt;mso-wrap-distance-bottom:0;mso-position-horizontal:absolute;mso-position-horizontal-relative:text;mso-position-vertical:absolute;mso-position-vertical-relative:text;mso-width-percent:0;mso-height-percent:0;mso-width-relative:margin;mso-height-relative:margin;v-text-anchor:top" o:gfxdata="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" filled="f" stroked="f" strokeweight=".5pt">
+              <v:shape w14:anchorId="129A1F1C" id="Cuadro de texto 16" o:spid="_x0000_s1029" type="#_x0000_t202" style="position:absolute;margin-left:29.45pt;margin-top:9.45pt;width:174.65pt;height:64.5pt;z-index:251661312;visibility:visible;mso-wrap-style:square;mso-width-percent:0;mso-height-percent:0;mso-wrap-distance-left:9pt;mso-wrap-distance-top:0;mso-wrap-distance-right:9pt;mso-wrap-distance-bottom:0;mso-position-horizontal:absolute;mso-position-horizontal-relative:text;mso-position-vertical:absolute;mso-position-vertical-relative:text;mso-width-percent:0;mso-height-percent:0;mso-width-relative:margin;mso-height-relative:margin;v-text-anchor:top" o:gfxdata="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" filled="f" stroked="f" strokeweight=".5pt">
                 <v:textbox>
                   <w:txbxContent>
                     <w:p>
@@ -8330,7 +8595,7 @@
           </mc:Choice>
           <mc:Fallback>
             <w:pict>
-              <v:shape w14:anchorId="7776F69C" id="Cuadro de texto 17" o:spid="_x0000_s1030" type="#_x0000_t202" style="position:absolute;margin-left:290.15pt;margin-top:10.05pt;width:132.75pt;height:69.75pt;z-index:251662336;visibility:visible;mso-wrap-style:square;mso-width-percent:0;mso-height-percent:0;mso-wrap-distance-left:9pt;mso-wrap-distance-top:0;mso-wrap-distance-right:9pt;mso-wrap-distance-bottom:0;mso-position-horizontal:absolute;mso-position-horizontal-relative:margin;mso-position-vertical:absolute;mso-position-vertical-relative:text;mso-width-percent:0;mso-height-percent:0;mso-width-relative:margin;mso-height-relative:margin;v-text-anchor:top" o:gfxdata="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" filled="f" stroked="f" strokeweight=".5pt">
+              <v:shape w14:anchorId="7776F69C" id="Cuadro de texto 17" o:spid="_x0000_s1030" type="#_x0000_t202" style="position:absolute;margin-left:290.15pt;margin-top:10.05pt;width:132.75pt;height:69.75pt;z-index:251662336;visibility:visible;mso-wrap-style:square;mso-width-percent:0;mso-height-percent:0;mso-wrap-distance-left:9pt;mso-wrap-distance-top:0;mso-wrap-distance-right:9pt;mso-wrap-distance-bottom:0;mso-position-horizontal:absolute;mso-position-horizontal-relative:margin;mso-position-vertical:absolute;mso-position-vertical-relative:text;mso-width-percent:0;mso-height-percent:0;mso-width-relative:margin;mso-height-relative:margin;v-text-anchor:top" o:gfxdata="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" filled="f" stroked="f" strokeweight=".5pt">
                 <v:textbox>
                   <w:txbxContent>
                     <w:p>
@@ -8497,7 +8762,7 @@
 </file>
 
 <file path=word/numbering.xml><?xml version="1.0" encoding="utf-8"?>
-<w:numbering xmlns:wpc="http://schemas.microsoft.com/office/word/2010/wordprocessingCanvas" xmlns:cx="http://schemas.microsoft.com/office/drawing/2014/chartex" xmlns:cx1="http://schemas.microsoft.com/office/drawing/2015/9/8/chartex" xmlns:cx2="http://schemas.microsoft.com/office/drawing/2015/10/21/chartex" xmlns:cx3="http://schemas.microsoft.com/office/drawing/2016/5/9/chartex" xmlns:cx4="http://schemas.microsoft.com/office/drawing/2016/5/10/chartex" xmlns:cx5="http://schemas.microsoft.com/office/drawing/2016/5/11/chartex" xmlns:cx6="http://schemas.microsoft.com/office/drawing/2016/5/12/chartex" xmlns:cx7="http://schemas.microsoft.com/office/drawing/2016/5/13/chartex" xmlns:cx8="http://schemas.microsoft.com/office/drawing/2016/5/14/chartex" xmlns:mc="http://schemas.openxmlformats.org/markup-compatibility/2006" xmlns:aink="http://schemas.microsoft.com/office/drawing/2016/ink" xmlns:am3d="http://schemas.microsoft.com/office/drawing/2017/model3d" xmlns:o="urn:schemas-microsoft-com:office:office" xmlns:r="http://schemas.openxmlformats.org/officeDocument/2006/relationships" xmlns:m="http://schemas.openxmlformats.org/officeDocument/2006/math" xmlns:v="urn:schemas-microsoft-com:vml" xmlns:wp14="http://schemas.microsoft.com/office/word/2010/wordprocessingDrawing" xmlns:wp="http://schemas.openxmlformats.org/drawingml/2006/wordprocessingDrawing" xmlns:w10="urn:schemas-microsoft-com:office:word" xmlns:w="http://schemas.openxmlformats.org/wordprocessingml/2006/main" xmlns:w14="http://schemas.microsoft.com/office/word/2010/wordml" xmlns:w15="http://schemas.microsoft.com/office/word/2012/wordml" xmlns:w16cex="http://schemas.microsoft.com/office/word/2018/wordml/cex" xmlns:w16cid="http://schemas.microsoft.com/office/word/2016/wordml/cid" xmlns:w16="http://schemas.microsoft.com/office/word/2018/wordml" xmlns:w16sdtdh="http://schemas.microsoft.com/office/word/2020/wordml/sdtdatahash" xmlns:w16se="http://schemas.microsoft.com/office/word/2015/wordml/symex" xmlns:wpg="http://schemas.microsoft.com/office/word/2010/wordprocessingGroup" xmlns:wpi="http://schemas.microsoft.com/office/word/2010/wordprocessingInk" xmlns:wne="http://schemas.microsoft.com/office/word/2006/wordml" xmlns:wps="http://schemas.microsoft.com/office/word/2010/wordprocessingShape" mc:Ignorable="w14 w15 w16se w16cid w16 w16cex w16sdtdh wp14">
+<w:numbering xmlns:wpc="http://schemas.microsoft.com/office/word/2010/wordprocessingCanvas" xmlns:cx="http://schemas.microsoft.com/office/drawing/2014/chartex" xmlns:cx1="http://schemas.microsoft.com/office/drawing/2015/9/8/chartex" xmlns:cx2="http://schemas.microsoft.com/office/drawing/2015/10/21/chartex" xmlns:cx3="http://schemas.microsoft.com/office/drawing/2016/5/9/chartex" xmlns:cx4="http://schemas.microsoft.com/office/drawing/2016/5/10/chartex" xmlns:cx5="http://schemas.microsoft.com/office/drawing/2016/5/11/chartex" xmlns:cx6="http://schemas.microsoft.com/office/drawing/2016/5/12/chartex" xmlns:cx7="http://schemas.microsoft.com/office/drawing/2016/5/13/chartex" xmlns:cx8="http://schemas.microsoft.com/office/drawing/2016/5/14/chartex" xmlns:mc="http://schemas.openxmlformats.org/markup-compatibility/2006" xmlns:aink="http://schemas.microsoft.com/office/drawing/2016/ink" xmlns:am3d="http://schemas.microsoft.com/office/drawing/2017/model3d" xmlns:o="urn:schemas-microsoft-com:office:office" xmlns:oel="http://schemas.microsoft.com/office/2019/extlst" xmlns:r="http://schemas.openxmlformats.org/officeDocument/2006/relationships" xmlns:m="http://schemas.openxmlformats.org/officeDocument/2006/math" xmlns:v="urn:schemas-microsoft-com:vml" xmlns:wp14="http://schemas.microsoft.com/office/word/2010/wordprocessingDrawing" xmlns:wp="http://schemas.openxmlformats.org/drawingml/2006/wordprocessingDrawing" xmlns:w10="urn:schemas-microsoft-com:office:word" xmlns:w="http://schemas.openxmlformats.org/wordprocessingml/2006/main" xmlns:w14="http://schemas.microsoft.com/office/word/2010/wordml" xmlns:w15="http://schemas.microsoft.com/office/word/2012/wordml" xmlns:w16cex="http://schemas.microsoft.com/office/word/2018/wordml/cex" xmlns:w16cid="http://schemas.microsoft.com/office/word/2016/wordml/cid" xmlns:w16="http://schemas.microsoft.com/office/word/2018/wordml" xmlns:w16du="http://schemas.microsoft.com/office/word/2023/wordml/word16du" xmlns:w16sdtdh="http://schemas.microsoft.com/office/word/2020/wordml/sdtdatahash" xmlns:w16sdtfl="http://schemas.microsoft.com/office/word/2024/wordml/sdtformatlock" xmlns:w16se="http://schemas.microsoft.com/office/word/2015/wordml/symex" xmlns:wpg="http://schemas.microsoft.com/office/word/2010/wordprocessingGroup" xmlns:wpi="http://schemas.microsoft.com/office/word/2010/wordprocessingInk" xmlns:wne="http://schemas.microsoft.com/office/word/2006/wordml" xmlns:wps="http://schemas.microsoft.com/office/word/2010/wordprocessingShape" mc:Ignorable="w14 w15 w16se w16cid w16 w16cex w16sdtdh w16sdtfl w16du wp14">
   <w:abstractNum w:abstractNumId="0" w15:restartNumberingAfterBreak="0">
     <w:nsid w:val="2CFE58DE"/>
     <w:multiLevelType w:val="hybridMultilevel"/>
@@ -8614,14 +8879,14 @@
       </w:rPr>
     </w:lvl>
   </w:abstractNum>
-  <w:num w:numId="1">
+  <w:num w:numId="1" w16cid:durableId="1982343222">
     <w:abstractNumId w:val="0"/>
   </w:num>
 </w:numbering>
 </file>
 
 <file path=word/styles.xml><?xml version="1.0" encoding="utf-8"?>
-<w:styles xmlns:mc="http://schemas.openxmlformats.org/markup-compatibility/2006" xmlns:r="http://schemas.openxmlformats.org/officeDocument/2006/relationships" xmlns:w="http://schemas.openxmlformats.org/wordprocessingml/2006/main" xmlns:w14="http://schemas.microsoft.com/office/word/2010/wordml" xmlns:w15="http://schemas.microsoft.com/office/word/2012/wordml" xmlns:w16cex="http://schemas.microsoft.com/office/word/2018/wordml/cex" xmlns:w16cid="http://schemas.microsoft.com/office/word/2016/wordml/cid" xmlns:w16="http://schemas.microsoft.com/office/word/2018/wordml" xmlns:w16sdtdh="http://schemas.microsoft.com/office/word/2020/wordml/sdtdatahash" xmlns:w16se="http://schemas.microsoft.com/office/word/2015/wordml/symex" mc:Ignorable="w14 w15 w16se w16cid w16 w16cex w16sdtdh">
+<w:styles xmlns:mc="http://schemas.openxmlformats.org/markup-compatibility/2006" xmlns:r="http://schemas.openxmlformats.org/officeDocument/2006/relationships" xmlns:w="http://schemas.openxmlformats.org/wordprocessingml/2006/main" xmlns:w14="http://schemas.microsoft.com/office/word/2010/wordml" xmlns:w15="http://schemas.microsoft.com/office/word/2012/wordml" xmlns:w16cex="http://schemas.microsoft.com/office/word/2018/wordml/cex" xmlns:w16cid="http://schemas.microsoft.com/office/word/2016/wordml/cid" xmlns:w16="http://schemas.microsoft.com/office/word/2018/wordml" xmlns:w16du="http://schemas.microsoft.com/office/word/2023/wordml/word16du" xmlns:w16sdtdh="http://schemas.microsoft.com/office/word/2020/wordml/sdtdatahash" xmlns:w16sdtfl="http://schemas.microsoft.com/office/word/2024/wordml/sdtformatlock" xmlns:w16se="http://schemas.microsoft.com/office/word/2015/wordml/symex" mc:Ignorable="w14 w15 w16se w16cid w16 w16cex w16sdtdh w16sdtfl w16du">
   <w:docDefaults>
     <w:rPrDefault>
       <w:rPr>

</xml_diff>